<commit_message>
Respuesta CIE R1 final
</commit_message>
<xml_diff>
--- a/Ética/R1/Cuestionario_Sociodemografico_Estudio_2.docx
+++ b/Ética/R1/Cuestionario_Sociodemografico_Estudio_2.docx
@@ -49,29 +49,26 @@
         </w:rPr>
       </w:pPr>
       <w:r>
-        <w:rPr>
-          <w:noProof/>
-        </w:rPr>
         <w:drawing>
-          <wp:inline distT="0" distB="0" distL="0" distR="0" wp14:anchorId="4916EA7E" wp14:editId="5A2F38F1">
-            <wp:extent cx="3963790" cy="2083241"/>
+          <wp:inline wp14:editId="2A28AB4D" wp14:anchorId="4916EA7E">
+            <wp:extent cx="3070094" cy="1613543"/>
             <wp:effectExtent l="0" t="0" r="0" b="0"/>
             <wp:docPr id="53238503" name="Picture 53238503" descr="A logo of a baby and a person's face&#10;&#10;AI-generated content may be incorrect."/>
             <wp:cNvGraphicFramePr>
-              <a:graphicFrameLocks xmlns:a="http://schemas.openxmlformats.org/drawingml/2006/main" noChangeAspect="1"/>
+              <a:graphicFrameLocks noChangeAspect="1"/>
             </wp:cNvGraphicFramePr>
-            <a:graphic xmlns:a="http://schemas.openxmlformats.org/drawingml/2006/main">
-              <a:graphicData uri="http://schemas.openxmlformats.org/drawingml/2006/picture">
+            <a:graphic>
+              <a:graphicData xmlns:a="http://schemas.openxmlformats.org/drawingml/2006/main" uri="http://schemas.openxmlformats.org/drawingml/2006/picture">
                 <pic:pic xmlns:pic="http://schemas.openxmlformats.org/drawingml/2006/picture">
                   <pic:nvPicPr>
                     <pic:cNvPr id="53238503" name="Picture 53238503" descr="A logo of a baby and a person's face&#10;&#10;AI-generated content may be incorrect."/>
                     <pic:cNvPicPr/>
                   </pic:nvPicPr>
                   <pic:blipFill>
-                    <a:blip r:embed="rId7" cstate="print">
+                    <a:blip xmlns:r="http://schemas.openxmlformats.org/officeDocument/2006/relationships" r:embed="rId7" cstate="print">
                       <a:extLst>
                         <a:ext uri="{28A0092B-C50C-407E-A947-70E740481C1C}">
-                          <a14:useLocalDpi xmlns:a14="http://schemas.microsoft.com/office/drawing/2010/main" val="0"/>
+                          <a14:useLocalDpi xmlns:a14="http://schemas.microsoft.com/office/drawing/2010/main"/>
                         </a:ext>
                       </a:extLst>
                     </a:blip>
@@ -80,9 +77,9 @@
                     </a:stretch>
                   </pic:blipFill>
                   <pic:spPr>
-                    <a:xfrm>
+                    <a:xfrm rot="0">
                       <a:off x="0" y="0"/>
-                      <a:ext cx="3991122" cy="2097606"/>
+                      <a:ext cx="3070094" cy="1613543"/>
                     </a:xfrm>
                     <a:prstGeom prst="rect">
                       <a:avLst/>
@@ -1013,6 +1010,23 @@
     </w:p>
     <w:p>
       <w:pPr>
+        <w:tabs>
+          <w:tab w:val="left" w:leader="none" w:pos="360"/>
+        </w:tabs>
+        <w:spacing w:before="0" w:beforeAutospacing="off" w:after="0" w:afterAutospacing="off"/>
+        <w:ind w:left="1417" w:right="0"/>
+        <w:rPr>
+          <w:rFonts w:ascii="Calibri" w:hAnsi="Calibri" w:eastAsia="Calibri" w:cs="Calibri"/>
+          <w:noProof w:val="0"/>
+          <w:color w:val="000000" w:themeColor="text1" w:themeTint="FF" w:themeShade="FF"/>
+          <w:sz w:val="22"/>
+          <w:szCs w:val="22"/>
+          <w:lang w:val="es-CO"/>
+        </w:rPr>
+      </w:pPr>
+    </w:p>
+    <w:p>
+      <w:pPr>
         <w:pStyle w:val="Heading1"/>
         <w:spacing w:before="0" w:beforeAutospacing="off" w:after="0" w:afterAutospacing="off"/>
       </w:pPr>
@@ -1022,12 +1036,312 @@
           <w:b w:val="1"/>
           <w:bCs w:val="1"/>
           <w:noProof w:val="0"/>
-          <w:sz w:val="48"/>
-          <w:szCs w:val="48"/>
-          <w:lang w:val="es-CO"/>
-        </w:rPr>
-        <w:t xml:space="preserve"> </w:t>
-      </w:r>
+          <w:color w:val="000000" w:themeColor="text1" w:themeTint="FF" w:themeShade="FF"/>
+          <w:sz w:val="26"/>
+          <w:szCs w:val="26"/>
+          <w:lang w:val="es-CO"/>
+        </w:rPr>
+        <w:t>2. Información del niño o niña</w:t>
+      </w:r>
+    </w:p>
+    <w:p>
+      <w:pPr>
+        <w:spacing w:before="0" w:beforeAutospacing="off" w:after="0" w:afterAutospacing="off"/>
+        <w:ind w:left="709" w:right="0"/>
+      </w:pPr>
+      <w:r>
+        <w:rPr>
+          <w:rFonts w:ascii="Calibri" w:hAnsi="Calibri" w:eastAsia="Calibri" w:cs="Calibri"/>
+          <w:noProof w:val="0"/>
+          <w:color w:val="000000" w:themeColor="text1" w:themeTint="FF" w:themeShade="FF"/>
+          <w:sz w:val="22"/>
+          <w:szCs w:val="22"/>
+          <w:lang w:val="es-CO"/>
+        </w:rPr>
+        <w:t>1. Nombre del niño o niña: _________________________________</w:t>
+      </w:r>
+    </w:p>
+    <w:p>
+      <w:pPr>
+        <w:spacing w:before="0" w:beforeAutospacing="off" w:after="0" w:afterAutospacing="off"/>
+        <w:ind w:left="709" w:right="0"/>
+        <w:rPr>
+          <w:rFonts w:ascii="Calibri" w:hAnsi="Calibri" w:eastAsia="Calibri" w:cs="Calibri"/>
+          <w:noProof w:val="0"/>
+          <w:color w:val="000000" w:themeColor="text1" w:themeTint="FF" w:themeShade="FF"/>
+          <w:sz w:val="22"/>
+          <w:szCs w:val="22"/>
+          <w:lang w:val="es-CO"/>
+        </w:rPr>
+      </w:pPr>
+      <w:r>
+        <w:rPr>
+          <w:rFonts w:ascii="Calibri" w:hAnsi="Calibri" w:eastAsia="Calibri" w:cs="Calibri"/>
+          <w:noProof w:val="0"/>
+          <w:color w:val="000000" w:themeColor="text1" w:themeTint="FF" w:themeShade="FF"/>
+          <w:sz w:val="22"/>
+          <w:szCs w:val="22"/>
+          <w:lang w:val="es-CO"/>
+        </w:rPr>
+        <w:t xml:space="preserve">2. Fecha de nacimiento: </w:t>
+      </w:r>
+      <w:r>
+        <w:rPr>
+          <w:rFonts w:ascii="Calibri" w:hAnsi="Calibri" w:eastAsia="Calibri" w:cs="Calibri"/>
+          <w:noProof w:val="0"/>
+          <w:color w:val="000000" w:themeColor="text1" w:themeTint="FF" w:themeShade="FF"/>
+          <w:sz w:val="22"/>
+          <w:szCs w:val="22"/>
+          <w:lang w:val="es-CO"/>
+        </w:rPr>
+        <w:t>Día</w:t>
+      </w:r>
+      <w:r>
+        <w:rPr>
+          <w:rFonts w:ascii="Calibri" w:hAnsi="Calibri" w:eastAsia="Calibri" w:cs="Calibri"/>
+          <w:noProof w:val="0"/>
+          <w:color w:val="000000" w:themeColor="text1" w:themeTint="FF" w:themeShade="FF"/>
+          <w:sz w:val="22"/>
+          <w:szCs w:val="22"/>
+          <w:lang w:val="es-CO"/>
+        </w:rPr>
+        <w:t xml:space="preserve">___ / </w:t>
+      </w:r>
+      <w:r>
+        <w:rPr>
+          <w:rFonts w:ascii="Calibri" w:hAnsi="Calibri" w:eastAsia="Calibri" w:cs="Calibri"/>
+          <w:noProof w:val="0"/>
+          <w:color w:val="000000" w:themeColor="text1" w:themeTint="FF" w:themeShade="FF"/>
+          <w:sz w:val="22"/>
+          <w:szCs w:val="22"/>
+          <w:lang w:val="es-CO"/>
+        </w:rPr>
+        <w:t>Mes</w:t>
+      </w:r>
+      <w:r>
+        <w:rPr>
+          <w:rFonts w:ascii="Calibri" w:hAnsi="Calibri" w:eastAsia="Calibri" w:cs="Calibri"/>
+          <w:noProof w:val="0"/>
+          <w:color w:val="000000" w:themeColor="text1" w:themeTint="FF" w:themeShade="FF"/>
+          <w:sz w:val="22"/>
+          <w:szCs w:val="22"/>
+          <w:lang w:val="es-CO"/>
+        </w:rPr>
+        <w:t xml:space="preserve">___ / </w:t>
+      </w:r>
+      <w:r>
+        <w:rPr>
+          <w:rFonts w:ascii="Calibri" w:hAnsi="Calibri" w:eastAsia="Calibri" w:cs="Calibri"/>
+          <w:noProof w:val="0"/>
+          <w:color w:val="000000" w:themeColor="text1" w:themeTint="FF" w:themeShade="FF"/>
+          <w:sz w:val="22"/>
+          <w:szCs w:val="22"/>
+          <w:lang w:val="es-CO"/>
+        </w:rPr>
+        <w:t>Año</w:t>
+      </w:r>
+      <w:r>
+        <w:rPr>
+          <w:rFonts w:ascii="Calibri" w:hAnsi="Calibri" w:eastAsia="Calibri" w:cs="Calibri"/>
+          <w:noProof w:val="0"/>
+          <w:color w:val="000000" w:themeColor="text1" w:themeTint="FF" w:themeShade="FF"/>
+          <w:sz w:val="22"/>
+          <w:szCs w:val="22"/>
+          <w:lang w:val="es-CO"/>
+        </w:rPr>
+        <w:t>______</w:t>
+      </w:r>
+    </w:p>
+    <w:p>
+      <w:pPr>
+        <w:spacing w:before="0" w:beforeAutospacing="off" w:after="0" w:afterAutospacing="off"/>
+        <w:ind w:left="709" w:right="0"/>
+      </w:pPr>
+      <w:r>
+        <w:rPr>
+          <w:rFonts w:ascii="Calibri" w:hAnsi="Calibri" w:eastAsia="Calibri" w:cs="Calibri"/>
+          <w:noProof w:val="0"/>
+          <w:color w:val="000000" w:themeColor="text1" w:themeTint="FF" w:themeShade="FF"/>
+          <w:sz w:val="22"/>
+          <w:szCs w:val="22"/>
+          <w:lang w:val="es-CO"/>
+        </w:rPr>
+        <w:t>3. Sexo:</w:t>
+      </w:r>
+    </w:p>
+    <w:p>
+      <w:pPr>
+        <w:tabs>
+          <w:tab w:val="left" w:leader="none" w:pos="360"/>
+        </w:tabs>
+        <w:spacing w:before="0" w:beforeAutospacing="off" w:after="0" w:afterAutospacing="off"/>
+        <w:ind w:left="1417" w:right="0"/>
+      </w:pPr>
+      <w:r>
+        <w:rPr>
+          <w:rFonts w:ascii="Calibri" w:hAnsi="Calibri" w:eastAsia="Calibri" w:cs="Calibri"/>
+          <w:noProof w:val="0"/>
+          <w:color w:val="000000" w:themeColor="text1" w:themeTint="FF" w:themeShade="FF"/>
+          <w:sz w:val="22"/>
+          <w:szCs w:val="22"/>
+          <w:lang w:val="es-CO"/>
+        </w:rPr>
+        <w:t>☐ Femenino</w:t>
+      </w:r>
+    </w:p>
+    <w:p>
+      <w:pPr>
+        <w:tabs>
+          <w:tab w:val="left" w:leader="none" w:pos="360"/>
+        </w:tabs>
+        <w:spacing w:before="0" w:beforeAutospacing="off" w:after="0" w:afterAutospacing="off"/>
+        <w:ind w:left="1417" w:right="0"/>
+      </w:pPr>
+      <w:r>
+        <w:rPr>
+          <w:rFonts w:ascii="Calibri" w:hAnsi="Calibri" w:eastAsia="Calibri" w:cs="Calibri"/>
+          <w:noProof w:val="0"/>
+          <w:color w:val="000000" w:themeColor="text1" w:themeTint="FF" w:themeShade="FF"/>
+          <w:sz w:val="22"/>
+          <w:szCs w:val="22"/>
+          <w:lang w:val="es-CO"/>
+        </w:rPr>
+        <w:t>☐ Masculino</w:t>
+      </w:r>
+    </w:p>
+    <w:p>
+      <w:pPr>
+        <w:tabs>
+          <w:tab w:val="left" w:leader="none" w:pos="360"/>
+        </w:tabs>
+        <w:spacing w:before="0" w:beforeAutospacing="off" w:after="0" w:afterAutospacing="off"/>
+        <w:ind w:left="1417" w:right="0"/>
+      </w:pPr>
+      <w:r>
+        <w:rPr>
+          <w:rFonts w:ascii="Calibri" w:hAnsi="Calibri" w:eastAsia="Calibri" w:cs="Calibri"/>
+          <w:noProof w:val="0"/>
+          <w:color w:val="000000" w:themeColor="text1" w:themeTint="FF" w:themeShade="FF"/>
+          <w:sz w:val="22"/>
+          <w:szCs w:val="22"/>
+          <w:lang w:val="es-CO"/>
+        </w:rPr>
+        <w:t>☐ Prefiero no responder</w:t>
+      </w:r>
+    </w:p>
+    <w:p>
+      <w:pPr>
+        <w:spacing w:before="0" w:beforeAutospacing="off" w:after="0" w:afterAutospacing="off"/>
+        <w:ind w:left="709" w:right="0"/>
+      </w:pPr>
+      <w:r>
+        <w:rPr>
+          <w:rFonts w:ascii="Calibri" w:hAnsi="Calibri" w:eastAsia="Calibri" w:cs="Calibri"/>
+          <w:noProof w:val="0"/>
+          <w:color w:val="000000" w:themeColor="text1" w:themeTint="FF" w:themeShade="FF"/>
+          <w:sz w:val="22"/>
+          <w:szCs w:val="22"/>
+          <w:lang w:val="es-CO"/>
+        </w:rPr>
+        <w:t>4. Nivel de escolarización (si aplica):</w:t>
+      </w:r>
+    </w:p>
+    <w:p>
+      <w:pPr>
+        <w:tabs>
+          <w:tab w:val="left" w:leader="none" w:pos="360"/>
+        </w:tabs>
+        <w:spacing w:before="0" w:beforeAutospacing="off" w:after="0" w:afterAutospacing="off"/>
+        <w:ind w:left="1417" w:right="0"/>
+      </w:pPr>
+      <w:r>
+        <w:rPr>
+          <w:rFonts w:ascii="Calibri" w:hAnsi="Calibri" w:eastAsia="Calibri" w:cs="Calibri"/>
+          <w:noProof w:val="0"/>
+          <w:color w:val="000000" w:themeColor="text1" w:themeTint="FF" w:themeShade="FF"/>
+          <w:sz w:val="22"/>
+          <w:szCs w:val="22"/>
+          <w:lang w:val="es-CO"/>
+        </w:rPr>
+        <w:t>☐ Ninguno</w:t>
+      </w:r>
+    </w:p>
+    <w:p>
+      <w:pPr>
+        <w:tabs>
+          <w:tab w:val="left" w:leader="none" w:pos="360"/>
+        </w:tabs>
+        <w:spacing w:before="0" w:beforeAutospacing="off" w:after="0" w:afterAutospacing="off"/>
+        <w:ind w:left="1417" w:right="0"/>
+      </w:pPr>
+      <w:r>
+        <w:rPr>
+          <w:rFonts w:ascii="Calibri" w:hAnsi="Calibri" w:eastAsia="Calibri" w:cs="Calibri"/>
+          <w:noProof w:val="0"/>
+          <w:color w:val="000000" w:themeColor="text1" w:themeTint="FF" w:themeShade="FF"/>
+          <w:sz w:val="22"/>
+          <w:szCs w:val="22"/>
+          <w:lang w:val="es-CO"/>
+        </w:rPr>
+        <w:t>☐ Cuidado en casa</w:t>
+      </w:r>
+    </w:p>
+    <w:p>
+      <w:pPr>
+        <w:tabs>
+          <w:tab w:val="left" w:leader="none" w:pos="360"/>
+        </w:tabs>
+        <w:spacing w:before="0" w:beforeAutospacing="off" w:after="0" w:afterAutospacing="off"/>
+        <w:ind w:left="1417" w:right="0"/>
+      </w:pPr>
+      <w:r>
+        <w:rPr>
+          <w:rFonts w:ascii="Calibri" w:hAnsi="Calibri" w:eastAsia="Calibri" w:cs="Calibri"/>
+          <w:noProof w:val="0"/>
+          <w:color w:val="000000" w:themeColor="text1" w:themeTint="FF" w:themeShade="FF"/>
+          <w:sz w:val="22"/>
+          <w:szCs w:val="22"/>
+          <w:lang w:val="es-CO"/>
+        </w:rPr>
+        <w:t>☐ Jardín infantil / Centro de desarrollo</w:t>
+      </w:r>
+    </w:p>
+    <w:p>
+      <w:pPr>
+        <w:tabs>
+          <w:tab w:val="left" w:leader="none" w:pos="360"/>
+        </w:tabs>
+        <w:spacing w:before="0" w:beforeAutospacing="off" w:after="0" w:afterAutospacing="off"/>
+        <w:ind w:left="1417" w:right="0"/>
+      </w:pPr>
+      <w:r>
+        <w:rPr>
+          <w:rFonts w:ascii="Calibri" w:hAnsi="Calibri" w:eastAsia="Calibri" w:cs="Calibri"/>
+          <w:noProof w:val="0"/>
+          <w:color w:val="000000" w:themeColor="text1" w:themeTint="FF" w:themeShade="FF"/>
+          <w:sz w:val="22"/>
+          <w:szCs w:val="22"/>
+          <w:lang w:val="es-CO"/>
+        </w:rPr>
+        <w:t>☐ Otro: _____________________________________</w:t>
+      </w:r>
+    </w:p>
+    <w:p>
+      <w:pPr>
+        <w:tabs>
+          <w:tab w:val="left" w:leader="none" w:pos="360"/>
+        </w:tabs>
+        <w:spacing w:before="0" w:beforeAutospacing="off" w:after="0" w:afterAutospacing="off"/>
+        <w:ind w:left="1417" w:right="0"/>
+        <w:rPr>
+          <w:rFonts w:ascii="Calibri" w:hAnsi="Calibri" w:eastAsia="Calibri" w:cs="Calibri"/>
+          <w:noProof w:val="0"/>
+          <w:color w:val="000000" w:themeColor="text1" w:themeTint="FF" w:themeShade="FF"/>
+          <w:sz w:val="22"/>
+          <w:szCs w:val="22"/>
+          <w:lang w:val="es-CO"/>
+        </w:rPr>
+      </w:pPr>
     </w:p>
     <w:p>
       <w:pPr>
@@ -1045,215 +1359,7 @@
           <w:szCs w:val="26"/>
           <w:lang w:val="es-CO"/>
         </w:rPr>
-        <w:t>2. Información del niño o niña</w:t>
-      </w:r>
-    </w:p>
-    <w:p>
-      <w:pPr>
-        <w:spacing w:before="0" w:beforeAutospacing="off" w:after="0" w:afterAutospacing="off"/>
-        <w:ind w:left="709" w:right="0"/>
-      </w:pPr>
-      <w:r>
-        <w:rPr>
-          <w:rFonts w:ascii="Calibri" w:hAnsi="Calibri" w:eastAsia="Calibri" w:cs="Calibri"/>
-          <w:noProof w:val="0"/>
-          <w:color w:val="000000" w:themeColor="text1" w:themeTint="FF" w:themeShade="FF"/>
-          <w:sz w:val="22"/>
-          <w:szCs w:val="22"/>
-          <w:lang w:val="es-CO"/>
-        </w:rPr>
-        <w:t>1. Nombre del niño o niña: _________________________________</w:t>
-      </w:r>
-    </w:p>
-    <w:p>
-      <w:pPr>
-        <w:spacing w:before="0" w:beforeAutospacing="off" w:after="0" w:afterAutospacing="off"/>
-        <w:ind w:left="709" w:right="0"/>
-      </w:pPr>
-      <w:r>
-        <w:rPr>
-          <w:rFonts w:ascii="Calibri" w:hAnsi="Calibri" w:eastAsia="Calibri" w:cs="Calibri"/>
-          <w:noProof w:val="0"/>
-          <w:color w:val="000000" w:themeColor="text1" w:themeTint="FF" w:themeShade="FF"/>
-          <w:sz w:val="22"/>
-          <w:szCs w:val="22"/>
-          <w:lang w:val="es-CO"/>
-        </w:rPr>
-        <w:t>2. Fecha de nacimiento: ___ / ___ / ______</w:t>
-      </w:r>
-    </w:p>
-    <w:p>
-      <w:pPr>
-        <w:spacing w:before="0" w:beforeAutospacing="off" w:after="0" w:afterAutospacing="off"/>
-        <w:ind w:left="709" w:right="0"/>
-      </w:pPr>
-      <w:r>
-        <w:rPr>
-          <w:rFonts w:ascii="Calibri" w:hAnsi="Calibri" w:eastAsia="Calibri" w:cs="Calibri"/>
-          <w:noProof w:val="0"/>
-          <w:color w:val="000000" w:themeColor="text1" w:themeTint="FF" w:themeShade="FF"/>
-          <w:sz w:val="22"/>
-          <w:szCs w:val="22"/>
-          <w:lang w:val="es-CO"/>
-        </w:rPr>
-        <w:t>3. Sexo:</w:t>
-      </w:r>
-    </w:p>
-    <w:p>
-      <w:pPr>
-        <w:tabs>
-          <w:tab w:val="left" w:leader="none" w:pos="360"/>
-        </w:tabs>
-        <w:spacing w:before="0" w:beforeAutospacing="off" w:after="0" w:afterAutospacing="off"/>
-        <w:ind w:left="1417" w:right="0"/>
-      </w:pPr>
-      <w:r>
-        <w:rPr>
-          <w:rFonts w:ascii="Calibri" w:hAnsi="Calibri" w:eastAsia="Calibri" w:cs="Calibri"/>
-          <w:noProof w:val="0"/>
-          <w:color w:val="000000" w:themeColor="text1" w:themeTint="FF" w:themeShade="FF"/>
-          <w:sz w:val="22"/>
-          <w:szCs w:val="22"/>
-          <w:lang w:val="es-CO"/>
-        </w:rPr>
-        <w:t>☐ Femenino</w:t>
-      </w:r>
-    </w:p>
-    <w:p>
-      <w:pPr>
-        <w:tabs>
-          <w:tab w:val="left" w:leader="none" w:pos="360"/>
-        </w:tabs>
-        <w:spacing w:before="0" w:beforeAutospacing="off" w:after="0" w:afterAutospacing="off"/>
-        <w:ind w:left="1417" w:right="0"/>
-      </w:pPr>
-      <w:r>
-        <w:rPr>
-          <w:rFonts w:ascii="Calibri" w:hAnsi="Calibri" w:eastAsia="Calibri" w:cs="Calibri"/>
-          <w:noProof w:val="0"/>
-          <w:color w:val="000000" w:themeColor="text1" w:themeTint="FF" w:themeShade="FF"/>
-          <w:sz w:val="22"/>
-          <w:szCs w:val="22"/>
-          <w:lang w:val="es-CO"/>
-        </w:rPr>
-        <w:t>☐ Masculino</w:t>
-      </w:r>
-    </w:p>
-    <w:p>
-      <w:pPr>
-        <w:tabs>
-          <w:tab w:val="left" w:leader="none" w:pos="360"/>
-        </w:tabs>
-        <w:spacing w:before="0" w:beforeAutospacing="off" w:after="0" w:afterAutospacing="off"/>
-        <w:ind w:left="1417" w:right="0"/>
-      </w:pPr>
-      <w:r>
-        <w:rPr>
-          <w:rFonts w:ascii="Calibri" w:hAnsi="Calibri" w:eastAsia="Calibri" w:cs="Calibri"/>
-          <w:noProof w:val="0"/>
-          <w:color w:val="000000" w:themeColor="text1" w:themeTint="FF" w:themeShade="FF"/>
-          <w:sz w:val="22"/>
-          <w:szCs w:val="22"/>
-          <w:lang w:val="es-CO"/>
-        </w:rPr>
-        <w:t>☐ Prefiero no responder</w:t>
-      </w:r>
-    </w:p>
-    <w:p>
-      <w:pPr>
-        <w:spacing w:before="0" w:beforeAutospacing="off" w:after="0" w:afterAutospacing="off"/>
-        <w:ind w:left="709" w:right="0"/>
-      </w:pPr>
-      <w:r>
-        <w:rPr>
-          <w:rFonts w:ascii="Calibri" w:hAnsi="Calibri" w:eastAsia="Calibri" w:cs="Calibri"/>
-          <w:noProof w:val="0"/>
-          <w:color w:val="000000" w:themeColor="text1" w:themeTint="FF" w:themeShade="FF"/>
-          <w:sz w:val="22"/>
-          <w:szCs w:val="22"/>
-          <w:lang w:val="es-CO"/>
-        </w:rPr>
-        <w:t>4. Nivel de escolarización (si aplica):</w:t>
-      </w:r>
-    </w:p>
-    <w:p>
-      <w:pPr>
-        <w:tabs>
-          <w:tab w:val="left" w:leader="none" w:pos="360"/>
-        </w:tabs>
-        <w:spacing w:before="0" w:beforeAutospacing="off" w:after="0" w:afterAutospacing="off"/>
-        <w:ind w:left="1417" w:right="0"/>
-      </w:pPr>
-      <w:r>
-        <w:rPr>
-          <w:rFonts w:ascii="Calibri" w:hAnsi="Calibri" w:eastAsia="Calibri" w:cs="Calibri"/>
-          <w:noProof w:val="0"/>
-          <w:color w:val="000000" w:themeColor="text1" w:themeTint="FF" w:themeShade="FF"/>
-          <w:sz w:val="22"/>
-          <w:szCs w:val="22"/>
-          <w:lang w:val="es-CO"/>
-        </w:rPr>
-        <w:t>☐ Ninguno</w:t>
-      </w:r>
-    </w:p>
-    <w:p>
-      <w:pPr>
-        <w:tabs>
-          <w:tab w:val="left" w:leader="none" w:pos="360"/>
-        </w:tabs>
-        <w:spacing w:before="0" w:beforeAutospacing="off" w:after="0" w:afterAutospacing="off"/>
-        <w:ind w:left="1417" w:right="0"/>
-      </w:pPr>
-      <w:r>
-        <w:rPr>
-          <w:rFonts w:ascii="Calibri" w:hAnsi="Calibri" w:eastAsia="Calibri" w:cs="Calibri"/>
-          <w:noProof w:val="0"/>
-          <w:color w:val="000000" w:themeColor="text1" w:themeTint="FF" w:themeShade="FF"/>
-          <w:sz w:val="22"/>
-          <w:szCs w:val="22"/>
-          <w:lang w:val="es-CO"/>
-        </w:rPr>
-        <w:t>☐ Cuidado en casa</w:t>
-      </w:r>
-    </w:p>
-    <w:p>
-      <w:pPr>
-        <w:tabs>
-          <w:tab w:val="left" w:leader="none" w:pos="360"/>
-        </w:tabs>
-        <w:spacing w:before="0" w:beforeAutospacing="off" w:after="0" w:afterAutospacing="off"/>
-        <w:ind w:left="1417" w:right="0"/>
-      </w:pPr>
-      <w:r>
-        <w:rPr>
-          <w:rFonts w:ascii="Calibri" w:hAnsi="Calibri" w:eastAsia="Calibri" w:cs="Calibri"/>
-          <w:noProof w:val="0"/>
-          <w:color w:val="000000" w:themeColor="text1" w:themeTint="FF" w:themeShade="FF"/>
-          <w:sz w:val="22"/>
-          <w:szCs w:val="22"/>
-          <w:lang w:val="es-CO"/>
-        </w:rPr>
-        <w:t>☐ Jardín infantil / Centro de desarrollo</w:t>
-      </w:r>
-    </w:p>
-    <w:p>
-      <w:pPr>
-        <w:tabs>
-          <w:tab w:val="left" w:leader="none" w:pos="360"/>
-        </w:tabs>
-        <w:spacing w:before="0" w:beforeAutospacing="off" w:after="0" w:afterAutospacing="off"/>
-        <w:ind w:left="1417" w:right="0"/>
-      </w:pPr>
-      <w:r>
-        <w:rPr>
-          <w:rFonts w:ascii="Calibri" w:hAnsi="Calibri" w:eastAsia="Calibri" w:cs="Calibri"/>
-          <w:noProof w:val="0"/>
-          <w:color w:val="000000" w:themeColor="text1" w:themeTint="FF" w:themeShade="FF"/>
-          <w:sz w:val="22"/>
-          <w:szCs w:val="22"/>
-          <w:lang w:val="es-CO"/>
-        </w:rPr>
-        <w:t>☐ Otro: _____________________________________</w:t>
+        <w:t xml:space="preserve">3. Personas con quienes convive o interactúa frecuentemente el niño o niña </w:t>
       </w:r>
     </w:p>
     <w:p>
@@ -1267,12 +1373,170 @@
           <w:b w:val="1"/>
           <w:bCs w:val="1"/>
           <w:noProof w:val="0"/>
-          <w:sz w:val="48"/>
-          <w:szCs w:val="48"/>
-          <w:lang w:val="es-CO"/>
-        </w:rPr>
-        <w:t xml:space="preserve"> </w:t>
-      </w:r>
+          <w:color w:val="000000" w:themeColor="text1" w:themeTint="FF" w:themeShade="FF"/>
+          <w:sz w:val="22"/>
+          <w:szCs w:val="22"/>
+          <w:lang w:val="es-CO"/>
+        </w:rPr>
+        <w:t xml:space="preserve">     (Marca todas las que apliquen)</w:t>
+      </w:r>
+    </w:p>
+    <w:p>
+      <w:pPr>
+        <w:tabs>
+          <w:tab w:val="left" w:leader="none" w:pos="360"/>
+        </w:tabs>
+        <w:spacing w:before="0" w:beforeAutospacing="off" w:after="0" w:afterAutospacing="off"/>
+        <w:ind w:left="709" w:right="0"/>
+      </w:pPr>
+      <w:r>
+        <w:rPr>
+          <w:rFonts w:ascii="Calibri" w:hAnsi="Calibri" w:eastAsia="Calibri" w:cs="Calibri"/>
+          <w:noProof w:val="0"/>
+          <w:color w:val="000000" w:themeColor="text1" w:themeTint="FF" w:themeShade="FF"/>
+          <w:sz w:val="22"/>
+          <w:szCs w:val="22"/>
+          <w:lang w:val="es-CO"/>
+        </w:rPr>
+        <w:t>☐ Madre</w:t>
+      </w:r>
+    </w:p>
+    <w:p>
+      <w:pPr>
+        <w:tabs>
+          <w:tab w:val="left" w:leader="none" w:pos="360"/>
+        </w:tabs>
+        <w:spacing w:before="0" w:beforeAutospacing="off" w:after="0" w:afterAutospacing="off"/>
+        <w:ind w:left="709" w:right="0"/>
+      </w:pPr>
+      <w:r>
+        <w:rPr>
+          <w:rFonts w:ascii="Calibri" w:hAnsi="Calibri" w:eastAsia="Calibri" w:cs="Calibri"/>
+          <w:noProof w:val="0"/>
+          <w:color w:val="000000" w:themeColor="text1" w:themeTint="FF" w:themeShade="FF"/>
+          <w:sz w:val="22"/>
+          <w:szCs w:val="22"/>
+          <w:lang w:val="es-CO"/>
+        </w:rPr>
+        <w:t>☐ Padre</w:t>
+      </w:r>
+    </w:p>
+    <w:p>
+      <w:pPr>
+        <w:tabs>
+          <w:tab w:val="left" w:leader="none" w:pos="360"/>
+        </w:tabs>
+        <w:spacing w:before="0" w:beforeAutospacing="off" w:after="0" w:afterAutospacing="off"/>
+        <w:ind w:left="709" w:right="0"/>
+      </w:pPr>
+      <w:r>
+        <w:rPr>
+          <w:rFonts w:ascii="Calibri" w:hAnsi="Calibri" w:eastAsia="Calibri" w:cs="Calibri"/>
+          <w:noProof w:val="0"/>
+          <w:color w:val="000000" w:themeColor="text1" w:themeTint="FF" w:themeShade="FF"/>
+          <w:sz w:val="22"/>
+          <w:szCs w:val="22"/>
+          <w:lang w:val="es-CO"/>
+        </w:rPr>
+        <w:t>☐ Hermanos / Hermanas</w:t>
+      </w:r>
+    </w:p>
+    <w:p>
+      <w:pPr>
+        <w:tabs>
+          <w:tab w:val="left" w:leader="none" w:pos="360"/>
+        </w:tabs>
+        <w:spacing w:before="0" w:beforeAutospacing="off" w:after="0" w:afterAutospacing="off"/>
+        <w:ind w:left="709" w:right="0"/>
+      </w:pPr>
+      <w:r>
+        <w:rPr>
+          <w:rFonts w:ascii="Calibri" w:hAnsi="Calibri" w:eastAsia="Calibri" w:cs="Calibri"/>
+          <w:noProof w:val="0"/>
+          <w:color w:val="000000" w:themeColor="text1" w:themeTint="FF" w:themeShade="FF"/>
+          <w:sz w:val="22"/>
+          <w:szCs w:val="22"/>
+          <w:lang w:val="es-CO"/>
+        </w:rPr>
+        <w:t>☐ Abuelos / Abuelas</w:t>
+      </w:r>
+    </w:p>
+    <w:p>
+      <w:pPr>
+        <w:tabs>
+          <w:tab w:val="left" w:leader="none" w:pos="360"/>
+        </w:tabs>
+        <w:spacing w:before="0" w:beforeAutospacing="off" w:after="0" w:afterAutospacing="off"/>
+        <w:ind w:left="709" w:right="0"/>
+      </w:pPr>
+      <w:r>
+        <w:rPr>
+          <w:rFonts w:ascii="Calibri" w:hAnsi="Calibri" w:eastAsia="Calibri" w:cs="Calibri"/>
+          <w:noProof w:val="0"/>
+          <w:color w:val="000000" w:themeColor="text1" w:themeTint="FF" w:themeShade="FF"/>
+          <w:sz w:val="22"/>
+          <w:szCs w:val="22"/>
+          <w:lang w:val="es-CO"/>
+        </w:rPr>
+        <w:t>☐ Otros familiares (tíos, primos, etc.)</w:t>
+      </w:r>
+    </w:p>
+    <w:p>
+      <w:pPr>
+        <w:tabs>
+          <w:tab w:val="left" w:leader="none" w:pos="360"/>
+        </w:tabs>
+        <w:spacing w:before="0" w:beforeAutospacing="off" w:after="0" w:afterAutospacing="off"/>
+        <w:ind w:left="709" w:right="0"/>
+      </w:pPr>
+      <w:r>
+        <w:rPr>
+          <w:rFonts w:ascii="Calibri" w:hAnsi="Calibri" w:eastAsia="Calibri" w:cs="Calibri"/>
+          <w:noProof w:val="0"/>
+          <w:color w:val="000000" w:themeColor="text1" w:themeTint="FF" w:themeShade="FF"/>
+          <w:sz w:val="22"/>
+          <w:szCs w:val="22"/>
+          <w:lang w:val="es-CO"/>
+        </w:rPr>
+        <w:t>☐ Cuidador(a) externo(a)</w:t>
+      </w:r>
+    </w:p>
+    <w:p>
+      <w:pPr>
+        <w:tabs>
+          <w:tab w:val="left" w:leader="none" w:pos="360"/>
+        </w:tabs>
+        <w:spacing w:before="0" w:beforeAutospacing="off" w:after="0" w:afterAutospacing="off"/>
+        <w:ind w:left="709" w:right="0"/>
+      </w:pPr>
+      <w:r>
+        <w:rPr>
+          <w:rFonts w:ascii="Calibri" w:hAnsi="Calibri" w:eastAsia="Calibri" w:cs="Calibri"/>
+          <w:noProof w:val="0"/>
+          <w:color w:val="000000" w:themeColor="text1" w:themeTint="FF" w:themeShade="FF"/>
+          <w:sz w:val="22"/>
+          <w:szCs w:val="22"/>
+          <w:lang w:val="es-CO"/>
+        </w:rPr>
+        <w:t>☐ Otro: ___________________________________________</w:t>
+      </w:r>
+    </w:p>
+    <w:p>
+      <w:pPr>
+        <w:tabs>
+          <w:tab w:val="left" w:leader="none" w:pos="360"/>
+        </w:tabs>
+        <w:spacing w:before="0" w:beforeAutospacing="off" w:after="0" w:afterAutospacing="off"/>
+        <w:ind w:left="709" w:right="0"/>
+        <w:rPr>
+          <w:rFonts w:ascii="Calibri" w:hAnsi="Calibri" w:eastAsia="Calibri" w:cs="Calibri"/>
+          <w:noProof w:val="0"/>
+          <w:color w:val="000000" w:themeColor="text1" w:themeTint="FF" w:themeShade="FF"/>
+          <w:sz w:val="22"/>
+          <w:szCs w:val="22"/>
+          <w:lang w:val="es-CO"/>
+        </w:rPr>
+      </w:pPr>
     </w:p>
     <w:p>
       <w:pPr>
@@ -1290,26 +1554,41 @@
           <w:szCs w:val="26"/>
           <w:lang w:val="es-CO"/>
         </w:rPr>
-        <w:t xml:space="preserve">3. Personas con quienes convive o interactúa frecuentemente el niño o niña </w:t>
-      </w:r>
-    </w:p>
-    <w:p>
-      <w:pPr>
-        <w:pStyle w:val="Heading1"/>
-        <w:spacing w:before="0" w:beforeAutospacing="off" w:after="0" w:afterAutospacing="off"/>
-      </w:pPr>
-      <w:r>
-        <w:rPr>
-          <w:rFonts w:ascii="Calibri" w:hAnsi="Calibri" w:eastAsia="Calibri" w:cs="Calibri"/>
-          <w:b w:val="1"/>
-          <w:bCs w:val="1"/>
-          <w:noProof w:val="0"/>
-          <w:color w:val="000000" w:themeColor="text1" w:themeTint="FF" w:themeShade="FF"/>
-          <w:sz w:val="22"/>
-          <w:szCs w:val="22"/>
-          <w:lang w:val="es-CO"/>
-        </w:rPr>
-        <w:t xml:space="preserve">     (Marca todas las que apliquen)</w:t>
+        <w:t>4. Información adicional relevante</w:t>
+      </w:r>
+    </w:p>
+    <w:p>
+      <w:pPr>
+        <w:spacing w:before="0" w:beforeAutospacing="off" w:after="0" w:afterAutospacing="off"/>
+        <w:ind w:left="709" w:right="0"/>
+      </w:pPr>
+      <w:r>
+        <w:rPr>
+          <w:rFonts w:ascii="Calibri" w:hAnsi="Calibri" w:eastAsia="Calibri" w:cs="Calibri"/>
+          <w:noProof w:val="0"/>
+          <w:color w:val="000000" w:themeColor="text1" w:themeTint="FF" w:themeShade="FF"/>
+          <w:sz w:val="22"/>
+          <w:szCs w:val="22"/>
+          <w:lang w:val="es-CO"/>
+        </w:rPr>
+        <w:t>1. Idioma(s) hablado(s) en el hogar: _______________________________</w:t>
+      </w:r>
+    </w:p>
+    <w:p>
+      <w:pPr>
+        <w:spacing w:before="0" w:beforeAutospacing="off" w:after="0" w:afterAutospacing="off"/>
+        <w:ind w:left="709" w:right="0"/>
+      </w:pPr>
+      <w:r>
+        <w:rPr>
+          <w:rFonts w:ascii="Calibri" w:hAnsi="Calibri" w:eastAsia="Calibri" w:cs="Calibri"/>
+          <w:noProof w:val="0"/>
+          <w:color w:val="000000" w:themeColor="text1" w:themeTint="FF" w:themeShade="FF"/>
+          <w:sz w:val="22"/>
+          <w:szCs w:val="22"/>
+          <w:lang w:val="es-CO"/>
+        </w:rPr>
+        <w:t>2. ¿El niño o niña presenta algún diagnóstico médico o del desarrollo?</w:t>
       </w:r>
     </w:p>
     <w:p>
@@ -1318,6 +1597,43 @@
           <w:tab w:val="left" w:leader="none" w:pos="360"/>
         </w:tabs>
         <w:spacing w:before="0" w:beforeAutospacing="off" w:after="0" w:afterAutospacing="off"/>
+        <w:ind w:left="1417" w:right="0"/>
+      </w:pPr>
+      <w:r>
+        <w:rPr>
+          <w:rFonts w:ascii="Calibri" w:hAnsi="Calibri" w:eastAsia="Calibri" w:cs="Calibri"/>
+          <w:noProof w:val="0"/>
+          <w:color w:val="000000" w:themeColor="text1" w:themeTint="FF" w:themeShade="FF"/>
+          <w:sz w:val="22"/>
+          <w:szCs w:val="22"/>
+          <w:lang w:val="es-CO"/>
+        </w:rPr>
+        <w:t>☐ No</w:t>
+      </w:r>
+    </w:p>
+    <w:p>
+      <w:pPr>
+        <w:tabs>
+          <w:tab w:val="left" w:leader="none" w:pos="360"/>
+        </w:tabs>
+        <w:spacing w:before="0" w:beforeAutospacing="off" w:after="0" w:afterAutospacing="off"/>
+        <w:ind w:left="1417" w:right="0"/>
+      </w:pPr>
+      <w:r>
+        <w:rPr>
+          <w:rFonts w:ascii="Calibri" w:hAnsi="Calibri" w:eastAsia="Calibri" w:cs="Calibri"/>
+          <w:noProof w:val="0"/>
+          <w:color w:val="000000" w:themeColor="text1" w:themeTint="FF" w:themeShade="FF"/>
+          <w:sz w:val="22"/>
+          <w:szCs w:val="22"/>
+          <w:lang w:val="es-CO"/>
+        </w:rPr>
+        <w:t>☐ Sí (¿cuál?): __________________________________________</w:t>
+      </w:r>
+    </w:p>
+    <w:p>
+      <w:pPr>
+        <w:spacing w:before="0" w:beforeAutospacing="off" w:after="0" w:afterAutospacing="off"/>
         <w:ind w:left="709" w:right="0"/>
       </w:pPr>
       <w:r>
@@ -1329,7 +1645,7 @@
           <w:szCs w:val="22"/>
           <w:lang w:val="es-CO"/>
         </w:rPr>
-        <w:t>☐ Madre</w:t>
+        <w:t>3. ¿El niño o niña ha estado expuesto regularmente a música (canto, juegos musicales, clases, etc.)?</w:t>
       </w:r>
     </w:p>
     <w:p>
@@ -1338,6 +1654,43 @@
           <w:tab w:val="left" w:leader="none" w:pos="360"/>
         </w:tabs>
         <w:spacing w:before="0" w:beforeAutospacing="off" w:after="0" w:afterAutospacing="off"/>
+        <w:ind w:left="1417" w:right="0"/>
+      </w:pPr>
+      <w:r>
+        <w:rPr>
+          <w:rFonts w:ascii="Calibri" w:hAnsi="Calibri" w:eastAsia="Calibri" w:cs="Calibri"/>
+          <w:noProof w:val="0"/>
+          <w:color w:val="000000" w:themeColor="text1" w:themeTint="FF" w:themeShade="FF"/>
+          <w:sz w:val="22"/>
+          <w:szCs w:val="22"/>
+          <w:lang w:val="es-CO"/>
+        </w:rPr>
+        <w:t>☐ Sí</w:t>
+      </w:r>
+    </w:p>
+    <w:p>
+      <w:pPr>
+        <w:tabs>
+          <w:tab w:val="left" w:leader="none" w:pos="360"/>
+        </w:tabs>
+        <w:spacing w:before="0" w:beforeAutospacing="off" w:after="0" w:afterAutospacing="off"/>
+        <w:ind w:left="1417" w:right="0"/>
+      </w:pPr>
+      <w:r>
+        <w:rPr>
+          <w:rFonts w:ascii="Calibri" w:hAnsi="Calibri" w:eastAsia="Calibri" w:cs="Calibri"/>
+          <w:noProof w:val="0"/>
+          <w:color w:val="000000" w:themeColor="text1" w:themeTint="FF" w:themeShade="FF"/>
+          <w:sz w:val="22"/>
+          <w:szCs w:val="22"/>
+          <w:lang w:val="es-CO"/>
+        </w:rPr>
+        <w:t>☐ No</w:t>
+      </w:r>
+    </w:p>
+    <w:p>
+      <w:pPr>
+        <w:spacing w:before="0" w:beforeAutospacing="off" w:after="0" w:afterAutospacing="off"/>
         <w:ind w:left="709" w:right="0"/>
       </w:pPr>
       <w:r>
@@ -1349,312 +1702,22 @@
           <w:szCs w:val="22"/>
           <w:lang w:val="es-CO"/>
         </w:rPr>
-        <w:t>☐ Padre</w:t>
-      </w:r>
-    </w:p>
-    <w:p>
-      <w:pPr>
-        <w:tabs>
-          <w:tab w:val="left" w:leader="none" w:pos="360"/>
-        </w:tabs>
+        <w:t>Si respondió “sí”, describa brevemente: __________________________________</w:t>
+      </w:r>
+    </w:p>
+    <w:p>
+      <w:pPr>
         <w:spacing w:before="0" w:beforeAutospacing="off" w:after="0" w:afterAutospacing="off"/>
         <w:ind w:left="709" w:right="0"/>
-      </w:pPr>
-      <w:r>
-        <w:rPr>
-          <w:rFonts w:ascii="Calibri" w:hAnsi="Calibri" w:eastAsia="Calibri" w:cs="Calibri"/>
-          <w:noProof w:val="0"/>
-          <w:color w:val="000000" w:themeColor="text1" w:themeTint="FF" w:themeShade="FF"/>
-          <w:sz w:val="22"/>
-          <w:szCs w:val="22"/>
-          <w:lang w:val="es-CO"/>
-        </w:rPr>
-        <w:t>☐ Hermanos / Hermanas</w:t>
-      </w:r>
-    </w:p>
-    <w:p>
-      <w:pPr>
-        <w:tabs>
-          <w:tab w:val="left" w:leader="none" w:pos="360"/>
-        </w:tabs>
-        <w:spacing w:before="0" w:beforeAutospacing="off" w:after="0" w:afterAutospacing="off"/>
-        <w:ind w:left="709" w:right="0"/>
-      </w:pPr>
-      <w:r>
-        <w:rPr>
-          <w:rFonts w:ascii="Calibri" w:hAnsi="Calibri" w:eastAsia="Calibri" w:cs="Calibri"/>
-          <w:noProof w:val="0"/>
-          <w:color w:val="000000" w:themeColor="text1" w:themeTint="FF" w:themeShade="FF"/>
-          <w:sz w:val="22"/>
-          <w:szCs w:val="22"/>
-          <w:lang w:val="es-CO"/>
-        </w:rPr>
-        <w:t>☐ Abuelos / Abuelas</w:t>
-      </w:r>
-    </w:p>
-    <w:p>
-      <w:pPr>
-        <w:tabs>
-          <w:tab w:val="left" w:leader="none" w:pos="360"/>
-        </w:tabs>
-        <w:spacing w:before="0" w:beforeAutospacing="off" w:after="0" w:afterAutospacing="off"/>
-        <w:ind w:left="709" w:right="0"/>
-      </w:pPr>
-      <w:r>
-        <w:rPr>
-          <w:rFonts w:ascii="Calibri" w:hAnsi="Calibri" w:eastAsia="Calibri" w:cs="Calibri"/>
-          <w:noProof w:val="0"/>
-          <w:color w:val="000000" w:themeColor="text1" w:themeTint="FF" w:themeShade="FF"/>
-          <w:sz w:val="22"/>
-          <w:szCs w:val="22"/>
-          <w:lang w:val="es-CO"/>
-        </w:rPr>
-        <w:t>☐ Otros familiares (tíos, primos, etc.)</w:t>
-      </w:r>
-    </w:p>
-    <w:p>
-      <w:pPr>
-        <w:tabs>
-          <w:tab w:val="left" w:leader="none" w:pos="360"/>
-        </w:tabs>
-        <w:spacing w:before="0" w:beforeAutospacing="off" w:after="0" w:afterAutospacing="off"/>
-        <w:ind w:left="709" w:right="0"/>
-      </w:pPr>
-      <w:r>
-        <w:rPr>
-          <w:rFonts w:ascii="Calibri" w:hAnsi="Calibri" w:eastAsia="Calibri" w:cs="Calibri"/>
-          <w:noProof w:val="0"/>
-          <w:color w:val="000000" w:themeColor="text1" w:themeTint="FF" w:themeShade="FF"/>
-          <w:sz w:val="22"/>
-          <w:szCs w:val="22"/>
-          <w:lang w:val="es-CO"/>
-        </w:rPr>
-        <w:t>☐ Cuidador(a) externo(a)</w:t>
-      </w:r>
-    </w:p>
-    <w:p>
-      <w:pPr>
-        <w:tabs>
-          <w:tab w:val="left" w:leader="none" w:pos="360"/>
-        </w:tabs>
-        <w:spacing w:before="0" w:beforeAutospacing="off" w:after="0" w:afterAutospacing="off"/>
-        <w:ind w:left="709" w:right="0"/>
-      </w:pPr>
-      <w:r>
-        <w:rPr>
-          <w:rFonts w:ascii="Calibri" w:hAnsi="Calibri" w:eastAsia="Calibri" w:cs="Calibri"/>
-          <w:noProof w:val="0"/>
-          <w:color w:val="000000" w:themeColor="text1" w:themeTint="FF" w:themeShade="FF"/>
-          <w:sz w:val="22"/>
-          <w:szCs w:val="22"/>
-          <w:lang w:val="es-CO"/>
-        </w:rPr>
-        <w:t>☐ Otro: ___________________________________________</w:t>
-      </w:r>
-    </w:p>
-    <w:p>
-      <w:pPr>
-        <w:pStyle w:val="Heading1"/>
-        <w:spacing w:before="0" w:beforeAutospacing="off" w:after="0" w:afterAutospacing="off"/>
-      </w:pPr>
-      <w:r>
-        <w:rPr>
-          <w:rFonts w:ascii="Calibri" w:hAnsi="Calibri" w:eastAsia="Calibri" w:cs="Calibri"/>
-          <w:b w:val="1"/>
-          <w:bCs w:val="1"/>
-          <w:noProof w:val="0"/>
-          <w:sz w:val="48"/>
-          <w:szCs w:val="48"/>
-          <w:lang w:val="es-CO"/>
-        </w:rPr>
-        <w:t xml:space="preserve"> </w:t>
-      </w:r>
-    </w:p>
-    <w:p>
-      <w:pPr>
-        <w:pStyle w:val="Heading1"/>
-        <w:spacing w:before="0" w:beforeAutospacing="off" w:after="0" w:afterAutospacing="off"/>
-      </w:pPr>
-      <w:r>
-        <w:rPr>
-          <w:rFonts w:ascii="Calibri" w:hAnsi="Calibri" w:eastAsia="Calibri" w:cs="Calibri"/>
-          <w:b w:val="1"/>
-          <w:bCs w:val="1"/>
-          <w:noProof w:val="0"/>
-          <w:color w:val="000000" w:themeColor="text1" w:themeTint="FF" w:themeShade="FF"/>
-          <w:sz w:val="26"/>
-          <w:szCs w:val="26"/>
-          <w:lang w:val="es-CO"/>
-        </w:rPr>
-        <w:t>4. Información adicional relevante</w:t>
-      </w:r>
-    </w:p>
-    <w:p>
-      <w:pPr>
-        <w:spacing w:before="0" w:beforeAutospacing="off" w:after="0" w:afterAutospacing="off"/>
-        <w:ind w:left="709" w:right="0"/>
-      </w:pPr>
-      <w:r>
-        <w:rPr>
-          <w:rFonts w:ascii="Calibri" w:hAnsi="Calibri" w:eastAsia="Calibri" w:cs="Calibri"/>
-          <w:noProof w:val="0"/>
-          <w:color w:val="000000" w:themeColor="text1" w:themeTint="FF" w:themeShade="FF"/>
-          <w:sz w:val="22"/>
-          <w:szCs w:val="22"/>
-          <w:lang w:val="es-CO"/>
-        </w:rPr>
-        <w:t>1. Idioma(s) hablado(s) en el hogar: _______________________________</w:t>
-      </w:r>
-    </w:p>
-    <w:p>
-      <w:pPr>
-        <w:spacing w:before="0" w:beforeAutospacing="off" w:after="0" w:afterAutospacing="off"/>
-        <w:ind w:left="709" w:right="0"/>
-      </w:pPr>
-      <w:r>
-        <w:rPr>
-          <w:rFonts w:ascii="Calibri" w:hAnsi="Calibri" w:eastAsia="Calibri" w:cs="Calibri"/>
-          <w:noProof w:val="0"/>
-          <w:color w:val="000000" w:themeColor="text1" w:themeTint="FF" w:themeShade="FF"/>
-          <w:sz w:val="22"/>
-          <w:szCs w:val="22"/>
-          <w:lang w:val="es-CO"/>
-        </w:rPr>
-        <w:t>2. ¿El niño o niña presenta algún diagnóstico médico o del desarrollo?</w:t>
-      </w:r>
-    </w:p>
-    <w:p>
-      <w:pPr>
-        <w:tabs>
-          <w:tab w:val="left" w:leader="none" w:pos="360"/>
-        </w:tabs>
-        <w:spacing w:before="0" w:beforeAutospacing="off" w:after="0" w:afterAutospacing="off"/>
-        <w:ind w:left="1417" w:right="0"/>
-      </w:pPr>
-      <w:r>
-        <w:rPr>
-          <w:rFonts w:ascii="Calibri" w:hAnsi="Calibri" w:eastAsia="Calibri" w:cs="Calibri"/>
-          <w:noProof w:val="0"/>
-          <w:color w:val="000000" w:themeColor="text1" w:themeTint="FF" w:themeShade="FF"/>
-          <w:sz w:val="22"/>
-          <w:szCs w:val="22"/>
-          <w:lang w:val="es-CO"/>
-        </w:rPr>
-        <w:t>☐ No</w:t>
-      </w:r>
-    </w:p>
-    <w:p>
-      <w:pPr>
-        <w:tabs>
-          <w:tab w:val="left" w:leader="none" w:pos="360"/>
-        </w:tabs>
-        <w:spacing w:before="0" w:beforeAutospacing="off" w:after="0" w:afterAutospacing="off"/>
-        <w:ind w:left="1417" w:right="0"/>
-      </w:pPr>
-      <w:r>
-        <w:rPr>
-          <w:rFonts w:ascii="Calibri" w:hAnsi="Calibri" w:eastAsia="Calibri" w:cs="Calibri"/>
-          <w:noProof w:val="0"/>
-          <w:color w:val="000000" w:themeColor="text1" w:themeTint="FF" w:themeShade="FF"/>
-          <w:sz w:val="22"/>
-          <w:szCs w:val="22"/>
-          <w:lang w:val="es-CO"/>
-        </w:rPr>
-        <w:t>☐ Sí (¿cuál?): __________________________________________</w:t>
-      </w:r>
-    </w:p>
-    <w:p>
-      <w:pPr>
-        <w:spacing w:before="0" w:beforeAutospacing="off" w:after="0" w:afterAutospacing="off"/>
-        <w:ind w:left="709" w:right="0"/>
-      </w:pPr>
-      <w:r>
-        <w:rPr>
-          <w:rFonts w:ascii="Calibri" w:hAnsi="Calibri" w:eastAsia="Calibri" w:cs="Calibri"/>
-          <w:noProof w:val="0"/>
-          <w:color w:val="000000" w:themeColor="text1" w:themeTint="FF" w:themeShade="FF"/>
-          <w:sz w:val="22"/>
-          <w:szCs w:val="22"/>
-          <w:lang w:val="es-CO"/>
-        </w:rPr>
-        <w:t>3. ¿El niño o niña ha estado expuesto regularmente a música (canto, juegos musicales, clases, etc.)?</w:t>
-      </w:r>
-    </w:p>
-    <w:p>
-      <w:pPr>
-        <w:tabs>
-          <w:tab w:val="left" w:leader="none" w:pos="360"/>
-        </w:tabs>
-        <w:spacing w:before="0" w:beforeAutospacing="off" w:after="0" w:afterAutospacing="off"/>
-        <w:ind w:left="1417" w:right="0"/>
-      </w:pPr>
-      <w:r>
-        <w:rPr>
-          <w:rFonts w:ascii="Calibri" w:hAnsi="Calibri" w:eastAsia="Calibri" w:cs="Calibri"/>
-          <w:noProof w:val="0"/>
-          <w:color w:val="000000" w:themeColor="text1" w:themeTint="FF" w:themeShade="FF"/>
-          <w:sz w:val="22"/>
-          <w:szCs w:val="22"/>
-          <w:lang w:val="es-CO"/>
-        </w:rPr>
-        <w:t>☐ Sí</w:t>
-      </w:r>
-    </w:p>
-    <w:p>
-      <w:pPr>
-        <w:tabs>
-          <w:tab w:val="left" w:leader="none" w:pos="360"/>
-        </w:tabs>
-        <w:spacing w:before="0" w:beforeAutospacing="off" w:after="0" w:afterAutospacing="off"/>
-        <w:ind w:left="1417" w:right="0"/>
-      </w:pPr>
-      <w:r>
-        <w:rPr>
-          <w:rFonts w:ascii="Calibri" w:hAnsi="Calibri" w:eastAsia="Calibri" w:cs="Calibri"/>
-          <w:noProof w:val="0"/>
-          <w:color w:val="000000" w:themeColor="text1" w:themeTint="FF" w:themeShade="FF"/>
-          <w:sz w:val="22"/>
-          <w:szCs w:val="22"/>
-          <w:lang w:val="es-CO"/>
-        </w:rPr>
-        <w:t>☐ No</w:t>
-      </w:r>
-    </w:p>
-    <w:p>
-      <w:pPr>
-        <w:spacing w:before="0" w:beforeAutospacing="off" w:after="0" w:afterAutospacing="off"/>
-        <w:ind w:left="709" w:right="0"/>
-      </w:pPr>
-      <w:r>
-        <w:rPr>
-          <w:rFonts w:ascii="Calibri" w:hAnsi="Calibri" w:eastAsia="Calibri" w:cs="Calibri"/>
-          <w:noProof w:val="0"/>
-          <w:color w:val="000000" w:themeColor="text1" w:themeTint="FF" w:themeShade="FF"/>
-          <w:sz w:val="22"/>
-          <w:szCs w:val="22"/>
-          <w:lang w:val="es-CO"/>
-        </w:rPr>
-        <w:t>Si respondió “sí”, describa brevemente: __________________________________</w:t>
-      </w:r>
-    </w:p>
-    <w:p>
-      <w:pPr>
-        <w:pStyle w:val="Heading1"/>
-        <w:spacing w:before="0" w:beforeAutospacing="off" w:after="0" w:afterAutospacing="off"/>
-        <w:ind w:left="709" w:right="0"/>
-      </w:pPr>
-      <w:r>
-        <w:rPr>
-          <w:rFonts w:ascii="Calibri" w:hAnsi="Calibri" w:eastAsia="Calibri" w:cs="Calibri"/>
-          <w:b w:val="1"/>
-          <w:bCs w:val="1"/>
-          <w:noProof w:val="0"/>
-          <w:sz w:val="48"/>
-          <w:szCs w:val="48"/>
-          <w:lang w:val="es-CO"/>
-        </w:rPr>
-        <w:t xml:space="preserve"> </w:t>
-      </w:r>
+        <w:rPr>
+          <w:rFonts w:ascii="Calibri" w:hAnsi="Calibri" w:eastAsia="Calibri" w:cs="Calibri"/>
+          <w:noProof w:val="0"/>
+          <w:color w:val="000000" w:themeColor="text1" w:themeTint="FF" w:themeShade="FF"/>
+          <w:sz w:val="22"/>
+          <w:szCs w:val="22"/>
+          <w:lang w:val="es-CO"/>
+        </w:rPr>
+      </w:pPr>
     </w:p>
     <w:p>
       <w:pPr>

</xml_diff>